<commit_message>
Bugs & Security fixes
</commit_message>
<xml_diff>
--- a/Angerona_Capabilities_Bragsheet.docx
+++ b/Angerona_Capabilities_Bragsheet.docx
@@ -1389,6 +1389,408 @@
         </w:tc>
       </w:tr>
     </w:tbl>
+    <w:p>
+      <w:r>
+        <w:br w:type="page"/>
+      </w:r>
+    </w:p>
+    <w:p>
+      <w:pPr>
+        <w:keepNext/>
+        <w:spacing w:before="200" w:after="80"/>
+      </w:pPr>
+      <w:r>
+        <w:rPr>
+          <w:b/>
+          <w:sz w:val="32"/>
+        </w:rPr>
+        <w:t>v1.9.3 Cycle 3 Security, Reliability, and UX Update - 19 July 2026</w:t>
+      </w:r>
+    </w:p>
+    <w:p>
+      <w:pPr>
+        <w:spacing w:after="160"/>
+      </w:pPr>
+      <w:r>
+        <w:t>This appendix records the verified state of the three-part security, bug, performance, remediation, settings, voice, installer, and UI release sweep.</w:t>
+      </w:r>
+    </w:p>
+    <w:p>
+      <w:r>
+        <w:t>New and strengthened capabilities</w:t>
+      </w:r>
+    </w:p>
+    <w:p>
+      <w:pPr>
+        <w:keepNext/>
+        <w:spacing w:before="140" w:after="80"/>
+      </w:pPr>
+      <w:r>
+        <w:rPr>
+          <w:b/>
+          <w:sz w:val="26"/>
+        </w:rPr>
+        <w:t>New and strengthened capabilities</w:t>
+      </w:r>
+    </w:p>
+    <w:p/>
+    <w:p>
+      <w:pPr>
+        <w:spacing w:after="60"/>
+      </w:pPr>
+      <w:r>
+        <w:t>Settings now includes search-based routing, clearer validation, privacy-default restoration, live microphone selection, offline voice-model status/install controls, and a trusted-process workflow for recurring benign processes.</w:t>
+      </w:r>
+    </w:p>
+    <w:p/>
+    <w:p>
+      <w:pPr>
+        <w:spacing w:after="60"/>
+      </w:pPr>
+      <w:r>
+        <w:t>ARIA has a direct VOICE &amp; MIC button that opens the conversational settings page. Voice and microphone changes apply immediately after save.</w:t>
+      </w:r>
+    </w:p>
+    <w:p/>
+    <w:p>
+      <w:pPr>
+        <w:spacing w:after="60"/>
+      </w:pPr>
+      <w:r>
+        <w:t>The one-click Windows path installs pinned binary dependencies, verifies the offline speech model, prepares Ollama/llama3:8b, keeps persistent/runtime writes on the configured data drive, and terminates local llama3 models during shutdown.</w:t>
+      </w:r>
+    </w:p>
+    <w:p/>
+    <w:p>
+      <w:pPr>
+        <w:spacing w:after="60"/>
+      </w:pPr>
+      <w:r>
+        <w:t>The release workflow uses commit-pinned actions, a constrained Python 3.12 dependency set, compile/tests, PyInstaller collection rules, checksums, SBOM generation, and provenance/SBOM attestations.</w:t>
+      </w:r>
+    </w:p>
+    <w:p/>
+    <w:p>
+      <w:pPr>
+        <w:spacing w:after="60"/>
+      </w:pPr>
+      <w:r>
+        <w:t>A missed drill installs a narrow Purple Remediation Guard candidate for the exact inert marker; it does not mark the weakness fixed.</w:t>
+      </w:r>
+    </w:p>
+    <w:p/>
+    <w:p>
+      <w:pPr>
+        <w:spacing w:after="60"/>
+      </w:pPr>
+      <w:r>
+        <w:t>PATCHED status requires a Purple Guard detection from a different later run. Re-rendering the source run or a catch from an unrelated detector cannot self-certify remediation.</w:t>
+      </w:r>
+    </w:p>
+    <w:p/>
+    <w:p>
+      <w:pPr>
+        <w:spacing w:after="60"/>
+      </w:pPr>
+      <w:r>
+        <w:t>The after-action report separates detection coverage from response success and correlates a containment action to the exact detection artifact/process before crediting remediation.</w:t>
+      </w:r>
+    </w:p>
+    <w:p/>
+    <w:p>
+      <w:pPr>
+        <w:spacing w:after="60"/>
+      </w:pPr>
+      <w:r>
+        <w:t>The previous 0% symptom was traced to interval-based detector timing, weak artifact correlation, and same-run bookkeeping. The new path widens bounded evidence windows while retaining exact marker correlation and deduplication.</w:t>
+      </w:r>
+    </w:p>
+    <w:p>
+      <w:r>
+        <w:t>Security and privacy</w:t>
+      </w:r>
+    </w:p>
+    <w:p>
+      <w:pPr>
+        <w:keepNext/>
+        <w:spacing w:before="140" w:after="80"/>
+      </w:pPr>
+      <w:r>
+        <w:rPr>
+          <w:b/>
+          <w:sz w:val="26"/>
+        </w:rPr>
+        <w:t>Security and privacy</w:t>
+      </w:r>
+    </w:p>
+    <w:p/>
+    <w:p>
+      <w:pPr>
+        <w:spacing w:after="60"/>
+      </w:pPr>
+      <w:r>
+        <w:t>Credential persistence moved from plaintext project files to a Windows DPAPI-protected store. Clearing a credential now deletes both the protected value and its live environment value.</w:t>
+      </w:r>
+    </w:p>
+    <w:p/>
+    <w:p>
+      <w:pPr>
+        <w:spacing w:after="60"/>
+      </w:pPr>
+      <w:r>
+        <w:t>The elevated install trust root is established before Python, pip, build scripts, or local executables run. Its canonical ACL permits only SYSTEM and Administrators, and a protected trust marker prevents a forged fast-path bypass.</w:t>
+      </w:r>
+    </w:p>
+    <w:p/>
+    <w:p>
+      <w:pPr>
+        <w:spacing w:after="60"/>
+      </w:pPr>
+      <w:r>
+        <w:t>Packaged data directories are created atomically with an Administrators/SYSTEM-only Windows security descriptor; pre-created, reparse-point, or incorrectly owned roots are refused.</w:t>
+      </w:r>
+    </w:p>
+    <w:p/>
+    <w:p>
+      <w:pPr>
+        <w:spacing w:after="60"/>
+      </w:pPr>
+      <w:r>
+        <w:t>The Remote Bridge now uses mutual HMAC proof and per-connection AES-256-GCM, bounded connections/frames, loopback defaults, retry-safe cursors, and sender/receiver privacy filtering.</w:t>
+      </w:r>
+    </w:p>
+    <w:p/>
+    <w:p>
+      <w:pPr>
+        <w:spacing w:after="60"/>
+      </w:pPr>
+      <w:r>
+        <w:t>Teams now fails closed without an allowlist and authorizes immutable AAD object IDs only. Display names cannot impersonate an operator; service URLs, JWT claims, body size, timeouts, and concurrency are bounded.</w:t>
+      </w:r>
+    </w:p>
+    <w:p/>
+    <w:p>
+      <w:pPr>
+        <w:spacing w:after="60"/>
+      </w:pPr>
+      <w:r>
+        <w:t>YARA scanning now uses in-process YARA-X with compiled rules, traversal and size budgets, symlink refusal, deduplication, and no current-directory executable lookup.</w:t>
+      </w:r>
+    </w:p>
+    <w:p/>
+    <w:p>
+      <w:pPr>
+        <w:spacing w:after="60"/>
+      </w:pPr>
+      <w:r>
+        <w:t>SIEM egress defaults to certificate-verified TLS on port 6514. Plain TCP/UDP requires a separate explicit risk acknowledgement and common identifiers are redacted by default.</w:t>
+      </w:r>
+    </w:p>
+    <w:p/>
+    <w:p>
+      <w:pPr>
+        <w:spacing w:after="60"/>
+      </w:pPr>
+      <w:r>
+        <w:t>Cloud fallback remains off by default and sends only a bounded, sanitized operator question/posture summary. Cloud CTI escalation now applies the same path, host, address, URL, and credential minimization.</w:t>
+      </w:r>
+    </w:p>
+    <w:p/>
+    <w:p>
+      <w:pPr>
+        <w:spacing w:after="60"/>
+      </w:pPr>
+      <w:r>
+        <w:t>Incident-response bundles require explicit consent and exclude credentials, DPAPI blobs, raw identities, paths, addresses, command lines, databases, arbitrary files, and symlink targets.</w:t>
+      </w:r>
+    </w:p>
+    <w:p>
+      <w:r>
+        <w:t>Measured performance</w:t>
+      </w:r>
+    </w:p>
+    <w:p>
+      <w:pPr>
+        <w:keepNext/>
+        <w:spacing w:before="140" w:after="80"/>
+      </w:pPr>
+      <w:r>
+        <w:rPr>
+          <w:b/>
+          <w:sz w:val="26"/>
+        </w:rPr>
+        <w:t>Measured performance</w:t>
+      </w:r>
+    </w:p>
+    <w:p/>
+    <w:p>
+      <w:pPr>
+        <w:spacing w:after="60"/>
+      </w:pPr>
+      <w:r>
+        <w:t>EventBus hot-path processing measured 4.04x faster; memory snapshot processing measured 60.97x faster; controlled shutdown measured 3.13x faster.</w:t>
+      </w:r>
+    </w:p>
+    <w:p/>
+    <w:p>
+      <w:pPr>
+        <w:spacing w:after="60"/>
+      </w:pPr>
+      <w:r>
+        <w:t>ARIA posture sparkline reads improved from 393 ms to 83 ms (4.75x) and trend aggregation from 713 ms to 48 ms (14.92x). Under a forced SQLite writer lock the cached fallback returned in 0.031 ms.</w:t>
+      </w:r>
+    </w:p>
+    <w:p/>
+    <w:p>
+      <w:pPr>
+        <w:spacing w:after="60"/>
+      </w:pPr>
+      <w:r>
+        <w:t>Dashboard reads are non-blocking, subscriptions are deduplicated, caches are bounded, and high-cost scanner wake-up work is paced by the adaptive/eco scheduling path.</w:t>
+      </w:r>
+    </w:p>
+    <w:p/>
+    <w:p>
+      <w:pPr>
+        <w:spacing w:after="60"/>
+      </w:pPr>
+      <w:r>
+        <w:t>Vosk no longer performs a surprise model download during UI construction. The verified offline model is installed explicitly and is stored on the configured Angerona data drive.</w:t>
+      </w:r>
+    </w:p>
+    <w:p>
+      <w:r>
+        <w:t>Verification evidence</w:t>
+      </w:r>
+    </w:p>
+    <w:p>
+      <w:pPr>
+        <w:keepNext/>
+        <w:spacing w:before="140" w:after="80"/>
+      </w:pPr>
+      <w:r>
+        <w:rPr>
+          <w:b/>
+          <w:sz w:val="26"/>
+        </w:rPr>
+        <w:t>Verification evidence</w:t>
+      </w:r>
+    </w:p>
+    <w:p/>
+    <w:p>
+      <w:pPr>
+        <w:spacing w:after="60"/>
+      </w:pPr>
+      <w:r>
+        <w:t>Full Python test gate: 57 passed, 1 platform-specific skip.</w:t>
+      </w:r>
+    </w:p>
+    <w:p/>
+    <w:p>
+      <w:pPr>
+        <w:spacing w:after="60"/>
+      </w:pPr>
+      <w:r>
+        <w:t>Headless application and GUI harness: 26 passed, 0 failed.</w:t>
+      </w:r>
+    </w:p>
+    <w:p/>
+    <w:p>
+      <w:pPr>
+        <w:spacing w:after="60"/>
+      </w:pPr>
+      <w:r>
+        <w:t>ARIA subsystem suite: 13 passed, 0 failed; dependency consistency check clean.</w:t>
+      </w:r>
+    </w:p>
+    <w:p/>
+    <w:p>
+      <w:pPr>
+        <w:spacing w:after="60"/>
+      </w:pPr>
+      <w:r>
+        <w:t>Module discovery: 63 modules. Expected stopped, opt-in, and unavailable-local-model states remain explicitly reported rather than treated as product failures.</w:t>
+      </w:r>
+    </w:p>
+    <w:p>
+      <w:r>
+        <w:t>Public-release note</w:t>
+      </w:r>
+    </w:p>
+    <w:p>
+      <w:pPr>
+        <w:keepNext/>
+        <w:spacing w:before="140" w:after="80"/>
+      </w:pPr>
+      <w:r>
+        <w:rPr>
+          <w:b/>
+          <w:sz w:val="26"/>
+        </w:rPr>
+        <w:t>Public-release note</w:t>
+      </w:r>
+    </w:p>
+    <w:p/>
+    <w:p>
+      <w:pPr>
+        <w:spacing w:after="60"/>
+      </w:pPr>
+      <w:r>
+        <w:t>Current files are being scrubbed for usernames, local paths, credentials, and document author metadata before publication.</w:t>
+      </w:r>
+    </w:p>
+    <w:p/>
+    <w:p>
+      <w:pPr>
+        <w:spacing w:after="60"/>
+      </w:pPr>
+      <w:r>
+        <w:t>Publication remains blocked until Git history is rewritten or the repository is recreated, because deleted screenshots/shortcuts and historical author metadata can remain recoverable from earlier commits. History rewriting is intentionally not automatic.</w:t>
+      </w:r>
+    </w:p>
+    <w:p/>
+    <w:p>
+      <w:pPr>
+        <w:spacing w:after="60"/>
+      </w:pPr>
+      <w:r>
+        <w:t>Unsigned optional watchdog/driver artifacts must not be represented as production trust anchors. Public releases should use signed binaries and retain the documented reduced-capability fallback when they are absent.</w:t>
+      </w:r>
+    </w:p>
+    <w:p>
+      <w:r>
+        <w:br w:type="page"/>
+      </w:r>
+    </w:p>
+    <w:p>
+      <w:r>
+        <w:rPr>
+          <w:b/>
+          <w:sz w:val="36"/>
+        </w:rPr>
+        <w:t>v1.9.3 Final Installer and Publication Gate</w:t>
+      </w:r>
+    </w:p>
+    <w:p>
+      <w:r>
+        <w:t>? The recommended GitHub release is now a one-click protected install: it re-verifies both one-file executables, installs them under %ProgramFiles%\Angerona, creates the supported shortcut, and defaults mutable state to protected D:\AngeronaData on a fixed D: volume, with protected %ProgramData%\Angerona only when D: is unavailable. Legacy per-user C: spill is migrated collision-safely.</w:t>
+      </w:r>
+    </w:p>
+    <w:p>
+      <w:r>
+        <w:t>• The Black Box is built first and its SHA-256 is embedded in Angerona.exe. Frozen launch requires the same protected root, non-writable ACLs, no reparse points, and an exact digest match. The verified offline speech model and ARIA documentation are bundled.</w:t>
+      </w:r>
+    </w:p>
+    <w:p>
+      <w:r>
+        <w:t>• The full CPython 3.12 Windows release/tool dependency closure is pinned. Contributor source setup rejects an untrusted pre-existing virtual environment and only accepts Authenticode-valid official Python/Ollama executables. The public tree uses synthetic demo telemetry and contains no personal workstation identity or paths.</w:t>
+      </w:r>
+    </w:p>
+    <w:p>
+      <w:r>
+        <w:t>• Verification: 63 modules discovered; 57 automated tests passed with one platform skip; product self-check 26/26; ARIA 13/13. Current files are privacy-clean, but Git history still requires an explicit owner-approved rewrite or clean-repository publication before going public. Builds remain unsigned until an Authenticode certificate is supplied.</w:t>
+      </w:r>
+    </w:p>
     <w:sectPr>
       <w:footerReference w:type="default" r:id="rId7"/>
       <w:pgSz w:w="12240" w:h="15840" w:orient="portrait"/>

</xml_diff>